<commit_message>
Sửa số liệu sai trong biên bản họp 02
12 migration (không phải 13, đã đếm nhầm migration_lock.toml), 10 tính
năng trong giai đoạn 22/09 – 25/09 (không phải 9), đặc tả API hiện ở
phiên bản 2.2 (không phải 2.1).

Co-Authored-By: Claude Opus 5.5 <noreply@anthropic.com>
Claude-Session: https://claude.ai/code/session_01UeYia2cercm6Vuh8Tmyx3b
</commit_message>
<xml_diff>
--- a/docs/meeting-minutes/N01_MeetingMinutesReport_02_25092026_v1_0.docx
+++ b/docs/meeting-minutes/N01_MeetingMinutesReport_02_25092026_v1_0.docx
@@ -1672,7 +1672,7 @@
                 <w:szCs w:val="24"/>
                 <w:rtl w:val="0"/>
               </w:rPr>
-              <w:t xml:space="preserve">- Nhiệm vụ 4 (thiết kế lại cơ sở dữ liệu): đã hoàn thành tài liệu thiết kế dữ liệu (docs/erd.md, phiên bản 1.1 ngày 12/09/2026) và đặc tả API (docs/api-contract.md, phiên bản 2.1). Lược đồ được thiết kế sẵn cho chuỗi nhiều nhà thuốc (bảng stores, cột store_id).</w:t>
+              <w:t xml:space="preserve">- Nhiệm vụ 4 (thiết kế lại cơ sở dữ liệu): đã hoàn thành tài liệu thiết kế dữ liệu (docs/erd.md, phiên bản 1.1 ngày 12/09/2026) và đặc tả API (docs/api-contract.md, hiện ở phiên bản 2.2). Lược đồ được thiết kế sẵn cho chuỗi nhiều nhà thuốc (bảng stores, cột store_id).</w:t>
             </w:r>
           </w:p>
           <w:p>
@@ -2101,7 +2101,7 @@
                 <w:szCs w:val="24"/>
                 <w:rtl w:val="0"/>
               </w:rPr>
-              <w:t xml:space="preserve">- Số liệu mã nguồn tại thời điểm họp: 52 bảng trong lược đồ, 13 migration, 19 module backend, 36 tệp kiểm thử tích hợp chạy trên PostgreSQL thật.</w:t>
+              <w:t xml:space="preserve">- Số liệu mã nguồn tại thời điểm họp: 52 bảng trong lược đồ, 12 migration, 19 module backend, 36 tệp kiểm thử tích hợp chạy trên PostgreSQL thật.</w:t>
             </w:r>
           </w:p>
           <w:p>
@@ -2430,7 +2430,7 @@
                 <w:szCs w:val="24"/>
                 <w:rtl w:val="0"/>
               </w:rPr>
-              <w:t xml:space="preserve">- Nhiều tính năng lớn được đưa vào trong thời gian ngắn (riêng giai đoạn 22/09 – 25/09/2026 có 9 tính năng) và phần lớn chưa qua Pull Request, nên có rủi ro phát sinh lỗi hồi quy giữa các phân hệ.</w:t>
+              <w:t xml:space="preserve">- Nhiều tính năng lớn được đưa vào trong thời gian ngắn (riêng giai đoạn 22/09 – 25/09/2026 có 10 tính năng) và phần lớn chưa qua Pull Request, nên có rủi ro phát sinh lỗi hồi quy giữa các phân hệ.</w:t>
             </w:r>
           </w:p>
           <w:p>

</xml_diff>